<commit_message>
Updated with Enterprise-level Structure
</commit_message>
<xml_diff>
--- a/DOCS/Modules - NEW.docx
+++ b/DOCS/Modules - NEW.docx
@@ -60,114 +60,129 @@
       <w:r>
         <w:t>updateProduct</w:t>
       </w:r>
+    </w:p>
+    <w:p>
+      <w:r>
+        <w:t>getProducts</w:t>
+      </w:r>
+    </w:p>
+    <w:p>
+      <w:r>
+        <w:t>getProductsHistory</w:t>
+      </w:r>
+    </w:p>
+    <w:p>
+      <w:r>
+        <w:t>getProductsOnly</w:t>
+      </w:r>
+    </w:p>
+    <w:p>
+      <w:r>
+        <w:t>= = = = = = = =</w:t>
+      </w:r>
+    </w:p>
+    <w:p>
+      <w:r>
+        <w:t>Product Items Module</w:t>
+      </w:r>
+    </w:p>
+    <w:p>
+      <w:r>
+        <w:t>saveProductIngredients - Undone</w:t>
+      </w:r>
+    </w:p>
+    <w:p>
+      <w:r>
+        <w:t>updateProductIngredients</w:t>
+      </w:r>
+    </w:p>
+    <w:p>
+      <w:r>
+        <w:t>getIngredientsByProduct</w:t>
+      </w:r>
+    </w:p>
+    <w:p>
+      <w:r>
+        <w:t>= = = = = = = =</w:t>
+      </w:r>
+    </w:p>
+    <w:p>
+      <w:r>
+        <w:t>Stocks Module</w:t>
+      </w:r>
+    </w:p>
+    <w:p>
+      <w:r>
+        <w:t>saveStock</w:t>
+      </w:r>
+    </w:p>
+    <w:p>
+      <w:r>
+        <w:t>updateStock</w:t>
+      </w:r>
+    </w:p>
+    <w:p>
+      <w:r>
+        <w:t>getStocks</w:t>
+      </w:r>
+    </w:p>
+    <w:p>
+      <w:r>
+        <w:t>getStocksList – Undone</w:t>
+      </w:r>
+    </w:p>
+    <w:p>
+      <w:r>
+        <w:t>getStocksNameBasedId – Undone</w:t>
+      </w:r>
+    </w:p>
+    <w:p>
+      <w:r>
+        <w:t>getStocksReport</w:t>
+      </w:r>
+    </w:p>
+    <w:p>
+      <w:r>
+        <w:t>getLowStock</w:t>
+      </w:r>
+    </w:p>
+    <w:p>
+      <w:r>
+        <w:t>getStocksHistory</w:t>
+      </w:r>
+    </w:p>
+    <w:p>
+      <w:r>
+        <w:t>getStocksOnly</w:t>
+      </w:r>
+    </w:p>
+    <w:p/>
+    <w:p>
+      <w:r>
+        <w:t>= = = = = = =</w:t>
+      </w:r>
+    </w:p>
+    <w:p>
+      <w:r>
+        <w:t>Orders Module</w:t>
+      </w:r>
+    </w:p>
+    <w:p>
+      <w:pPr>
+        <w:rPr>
+          <w:rFonts w:hint="default"/>
+          <w:lang w:val="en-US"/>
+        </w:rPr>
+      </w:pPr>
+      <w:r>
+        <w:rPr>
+          <w:rFonts w:hint="default"/>
+          <w:lang w:val="en-US"/>
+        </w:rPr>
+        <w:t>getOrders (Enterprise-level structure in backend)</w:t>
+      </w:r>
       <w:bookmarkStart w:id="0" w:name="_GoBack"/>
       <w:bookmarkEnd w:id="0"/>
-    </w:p>
-    <w:p>
-      <w:r>
-        <w:t>getProducts</w:t>
-      </w:r>
-    </w:p>
-    <w:p>
-      <w:r>
-        <w:t>getProductsHistory</w:t>
-      </w:r>
-    </w:p>
-    <w:p>
-      <w:r>
-        <w:t>getProductsOnly</w:t>
-      </w:r>
-    </w:p>
-    <w:p>
-      <w:r>
-        <w:t>= = = = = = = =</w:t>
-      </w:r>
-    </w:p>
-    <w:p>
-      <w:r>
-        <w:t>Product Items Module</w:t>
-      </w:r>
-    </w:p>
-    <w:p>
-      <w:r>
-        <w:t>saveProductIngredients - Undone</w:t>
-      </w:r>
-    </w:p>
-    <w:p>
-      <w:r>
-        <w:t>updateProductIngredients</w:t>
-      </w:r>
-    </w:p>
-    <w:p>
-      <w:r>
-        <w:t>getIngredientsByProduct</w:t>
-      </w:r>
-    </w:p>
-    <w:p>
-      <w:r>
-        <w:t>= = = = = = = =</w:t>
-      </w:r>
-    </w:p>
-    <w:p>
-      <w:r>
-        <w:t>Stocks Module</w:t>
-      </w:r>
-    </w:p>
-    <w:p>
-      <w:r>
-        <w:t>saveStock – Undone</w:t>
-      </w:r>
-    </w:p>
-    <w:p>
-      <w:r>
-        <w:t>updateStock – Undone</w:t>
-      </w:r>
-    </w:p>
-    <w:p>
-      <w:r>
-        <w:t>getStocks</w:t>
-      </w:r>
-    </w:p>
-    <w:p>
-      <w:r>
-        <w:t>getStocksList – Undone</w:t>
-      </w:r>
-    </w:p>
-    <w:p>
-      <w:r>
-        <w:t>getStocksNameBasedId – Undone</w:t>
-      </w:r>
-    </w:p>
-    <w:p>
-      <w:r>
-        <w:t>getStocksReport</w:t>
-      </w:r>
-    </w:p>
-    <w:p>
-      <w:r>
-        <w:t>getLowStock</w:t>
-      </w:r>
-    </w:p>
-    <w:p>
-      <w:r>
-        <w:t>getStocksHistory – Undone</w:t>
-      </w:r>
-    </w:p>
-    <w:p>
-      <w:r>
-        <w:t>getStocksOnly</w:t>
-      </w:r>
-    </w:p>
-    <w:p/>
-    <w:p>
-      <w:r>
-        <w:t>= = = = = = =</w:t>
-      </w:r>
-    </w:p>
-    <w:p>
-      <w:r>
-        <w:t>Orders Module</w:t>
-      </w:r>
     </w:p>
     <w:p>
       <w:r>

</xml_diff>